<commit_message>
publish student projects (Fall 2026) 2026-09-22 19:55
</commit_message>
<xml_diff>
--- a/Games/framebreak.docx
+++ b/Games/framebreak.docx
@@ -2769,13 +2769,13 @@
         <w:rPr>
           <w:b/>
         </w:rPr>
-        <w:t xml:space="preserve">Recommended composition:</w:t>
-      </w:r>
-      <w:r>
-        <w:t xml:space="preserve"> </w:t>
-      </w:r>
-      <w:r>
-        <w:t xml:space="preserve">6 CS + 2 Design + 1 Art (9) — because the interactive objects are</w:t>
+        <w:t xml:space="preserve">Team composition (set by instructor):</w:t>
+      </w:r>
+      <w:r>
+        <w:t xml:space="preserve"> </w:t>
+      </w:r>
+      <w:r>
+        <w:t xml:space="preserve">6 CS + 1 Design + 0 Art (7) — because the interactive objects are</w:t>
       </w:r>
       <w:r>
         <w:t xml:space="preserve"> </w:t>
@@ -2787,7 +2787,52 @@
         <w:t xml:space="preserve">generated from photos rather than hand-authored</w:t>
       </w:r>
       <w:r>
-        <w:t xml:space="preserve">, the art surface is smaller than a typical 3D game (the cells/rooms, the time-of-day lighting, the camera/HUD and effects), so one artist can carry it; the</w:t>
+        <w:t xml:space="preserve">, the art surface is modest (the cells/rooms, the time-of-day lighting, the camera/HUD and effects), so 0 artists is more workable here than for a typical game — the single designer takes the</w:t>
+      </w:r>
+      <w:r>
+        <w:t xml:space="preserve"> </w:t>
+      </w:r>
+      <w:r>
+        <w:rPr>
+          <w:b/>
+        </w:rPr>
+        <w:t xml:space="preserve">D11 conditional</w:t>
+      </w:r>
+      <w:r>
+        <w:t xml:space="preserve"> </w:t>
+      </w:r>
+      <w:r>
+        <w:t xml:space="preserve">as a real graded Design goal each milestone (M1 Art Proof of Concept / M2 Art Implementation Quality — the last Design goal each milestone).</w:t>
+      </w:r>
+      <w:r>
+        <w:t xml:space="preserve"> </w:t>
+      </w:r>
+      <w:r>
+        <w:rPr>
+          <w:b/>
+        </w:rPr>
+        <w:t xml:space="preserve">Load flag:</w:t>
+      </w:r>
+      <w:r>
+        <w:t xml:space="preserve"> </w:t>
+      </w:r>
+      <w:r>
+        <w:t xml:space="preserve">the bigger squeeze is on</w:t>
+      </w:r>
+      <w:r>
+        <w:t xml:space="preserve"> </w:t>
+      </w:r>
+      <w:r>
+        <w:rPr>
+          <w:i/>
+        </w:rPr>
+        <w:t xml:space="preserve">design</w:t>
+      </w:r>
+      <w:r>
+        <w:t xml:space="preserve"> </w:t>
+      </w:r>
+      <w:r>
+        <w:t xml:space="preserve">— the</w:t>
       </w:r>
       <w:r>
         <w:t xml:space="preserve"> </w:t>
@@ -2802,7 +2847,79 @@
         <w:t xml:space="preserve"> </w:t>
       </w:r>
       <w:r>
-        <w:t xml:space="preserve">(attribute vocabulary, per-room exit-requirements, co-op puzzle design, the reworked economy, time-of-day variants), so two designers own it (rules: min 1 Design mandated, max 9 total, D+A ≤ 3; see</w:t>
+        <w:t xml:space="preserve">(attribute vocabulary, per-room exit-requirements, co-op puzzle design, the reworked economy, time-of-day variants), and one designer now carries all of that Design + UI/UX</w:t>
+      </w:r>
+      <w:r>
+        <w:t xml:space="preserve"> </w:t>
+      </w:r>
+      <w:r>
+        <w:rPr>
+          <w:i/>
+        </w:rPr>
+        <w:t xml:space="preserve">plus</w:t>
+      </w:r>
+      <w:r>
+        <w:t xml:space="preserve"> </w:t>
+      </w:r>
+      <w:r>
+        <w:t xml:space="preserve">the D11 art slot, which is a heavy load; strongly consider a</w:t>
+      </w:r>
+      <w:r>
+        <w:t xml:space="preserve"> </w:t>
+      </w:r>
+      <w:r>
+        <w:rPr>
+          <w:b/>
+        </w:rPr>
+        <w:t xml:space="preserve">2nd designer</w:t>
+      </w:r>
+      <w:r>
+        <w:t xml:space="preserve">.</w:t>
+      </w:r>
+      <w:r>
+        <w:t xml:space="preserve"> </w:t>
+      </w:r>
+      <w:r>
+        <w:rPr>
+          <w:b/>
+        </w:rPr>
+        <w:t xml:space="preserve">Required-adjustment note:</w:t>
+      </w:r>
+      <w:r>
+        <w:t xml:space="preserve"> </w:t>
+      </w:r>
+      <w:r>
+        <w:t xml:space="preserve">the 🔶</w:t>
+      </w:r>
+      <w:r>
+        <w:t xml:space="preserve"> </w:t>
+      </w:r>
+      <w:r>
+        <w:rPr>
+          <w:b/>
+        </w:rPr>
+        <w:t xml:space="preserve">monetization rework</w:t>
+      </w:r>
+      <w:r>
+        <w:t xml:space="preserve"> </w:t>
+      </w:r>
+      <w:r>
+        <w:t xml:space="preserve">(formerly its own M2D8 goal) now folds into</w:t>
+      </w:r>
+      <w:r>
+        <w:t xml:space="preserve"> </w:t>
+      </w:r>
+      <w:r>
+        <w:rPr>
+          <w:b/>
+        </w:rPr>
+        <w:t xml:space="preserve">M2D1</w:t>
+      </w:r>
+      <w:r>
+        <w:t xml:space="preserve"> </w:t>
+      </w:r>
+      <w:r>
+        <w:t xml:space="preserve">(Features Design Iteration) — the solo-designer + 0-artist load leaves no separate slot, but the non-pay-to-win rework is still required for approval (rules: min 1 Design mandated, max 9 total, D+A ≤ 3; see</w:t>
       </w:r>
       <w:r>
         <w:t xml:space="preserve"> </w:t>
@@ -2814,7 +2931,7 @@
         <w:t xml:space="preserve">team-formation.pdf</w:t>
       </w:r>
       <w:r>
-        <w:t xml:space="preserve">). If the environment art per time-of-day outgrows one artist, trade the 2nd designer for a 2nd artist.</w:t>
+        <w:t xml:space="preserve">).</w:t>
       </w:r>
       <w:r>
         <w:t xml:space="preserve"> </w:t>
@@ -2906,31 +3023,7 @@
         <w:pStyle w:val="Compact"/>
       </w:pPr>
       <w:r>
-        <w:t xml:space="preserve">M1D4 Game Feel &amp; Touch Interaction Specification (the photo-capture/framing feel and object placement, authored as tunable parameters)</w:t>
-      </w:r>
-    </w:p>
-    <w:p>
-      <w:pPr>
-        <w:numPr>
-          <w:ilvl w:val="1"/>
-          <w:numId w:val="1019"/>
-        </w:numPr>
-        <w:pStyle w:val="Compact"/>
-      </w:pPr>
-      <w:r>
-        <w:t xml:space="preserve">M1D5 Level &amp; Progression Design (the escape rooms + the exit-requirement attribute design, authored to the room-editor data format)</w:t>
-      </w:r>
-    </w:p>
-    <w:p>
-      <w:pPr>
-        <w:numPr>
-          <w:ilvl w:val="1"/>
-          <w:numId w:val="1019"/>
-        </w:numPr>
-        <w:pStyle w:val="Compact"/>
-      </w:pPr>
-      <w:r>
-        <w:t xml:space="preserve">M1D6 Systems &amp; Economy Design (the attribute vocabulary, the snap/charge budget and the — reworked, non-pay-to-win — economy)</w:t>
+        <w:t xml:space="preserve">M1D11 Art Proof of Concept *(conditional — no artist; Design-owned; modest surface since objects are photo-generated)* — the visual direction: the cells/rooms, the time-of-day lighting, the camera/HUD and effects; 2 mockups. *(The artist's absence + the drop to one designer squeeze out the M1D4/D5/D6 goals.)*</w:t>
       </w:r>
     </w:p>
     <w:p>
@@ -2957,7 +3050,22 @@
         <w:pStyle w:val="Compact"/>
       </w:pPr>
       <w:r>
-        <w:t xml:space="preserve">M2D1 ⭐ Features Design Iteration &amp; Showcase Readiness</w:t>
+        <w:t xml:space="preserve">M2D1 ⭐ Features Design Iteration &amp; Showcase Readiness —</w:t>
+      </w:r>
+      <w:r>
+        <w:t xml:space="preserve"> </w:t>
+      </w:r>
+      <w:r>
+        <w:rPr>
+          <w:b/>
+        </w:rPr>
+        <w:t xml:space="preserve">now also carries the required monetization rework</w:t>
+      </w:r>
+      <w:r>
+        <w:t xml:space="preserve"> </w:t>
+      </w:r>
+      <w:r>
+        <w:t xml:space="preserve">(snaps/hints become balance/earned, real-money restricted to cosmetics; clean-monetization, no pay-to-win + a scope-integrity statement), since the solo-designer + 0-artist load leaves no separate slot for the former M2D8 goal.</w:t>
       </w:r>
     </w:p>
     <w:p>
@@ -2969,43 +3077,7 @@
         <w:pStyle w:val="Compact"/>
       </w:pPr>
       <w:r>
-        <w:t xml:space="preserve">M2D3 Systems Balance &amp; Tuning — Data-Driven (attribute/room/charge balance via the team's JSON, no code changes)</w:t>
-      </w:r>
-    </w:p>
-    <w:p>
-      <w:pPr>
-        <w:numPr>
-          <w:ilvl w:val="1"/>
-          <w:numId w:val="1020"/>
-        </w:numPr>
-        <w:pStyle w:val="Compact"/>
-      </w:pPr>
-      <w:r>
-        <w:t xml:space="preserve">M2D5 Playtesting &amp; Iteration Program (test the puzzle clarity + the co-op flow, triage, re-test)</w:t>
-      </w:r>
-    </w:p>
-    <w:p>
-      <w:pPr>
-        <w:numPr>
-          <w:ilvl w:val="1"/>
-          <w:numId w:val="1020"/>
-        </w:numPr>
-        <w:pStyle w:val="Compact"/>
-      </w:pPr>
-      <w:r>
-        <w:t xml:space="preserve">M2D8 Monetization &amp; Scope Integrity Design — the</w:t>
-      </w:r>
-      <w:r>
-        <w:t xml:space="preserve"> </w:t>
-      </w:r>
-      <w:r>
-        <w:rPr>
-          <w:b/>
-        </w:rPr>
-        <w:t xml:space="preserve">required rework</w:t>
-      </w:r>
-      <w:r>
-        <w:t xml:space="preserve">: snaps/hints become balance/earned, real-money purchases restricted to cosmetics (clean-monetization, no pay-to-win) + a scope-integrity statement</w:t>
+        <w:t xml:space="preserve">M2D11 Art Implementation Quality *(conditional — no artist; Design-owned)* — the cells/rooms, time-of-day lighting, camera/HUD and effects implemented in-engine, no placeholders (interactive objects come from the photo pipeline).</w:t>
       </w:r>
     </w:p>
     <w:p>
@@ -3044,30 +3116,6 @@
     <w:p>
       <w:pPr>
         <w:numPr>
-          <w:ilvl w:val="1"/>
-          <w:numId w:val="1021"/>
-        </w:numPr>
-        <w:pStyle w:val="Compact"/>
-      </w:pPr>
-      <w:r>
-        <w:t xml:space="preserve">M1U2 UX Flows &amp; Wireframes — Menus → HUD — the scout → frame → snap → spawn → solve flow, solo and co-op.</w:t>
-      </w:r>
-    </w:p>
-    <w:p>
-      <w:pPr>
-        <w:numPr>
-          <w:ilvl w:val="1"/>
-          <w:numId w:val="1021"/>
-        </w:numPr>
-        <w:pStyle w:val="Compact"/>
-      </w:pPr>
-      <w:r>
-        <w:t xml:space="preserve">M1U3 Accessibility &amp; Readability Foundations — legible status/generation feedback and reachable capture controls on a phone.</w:t>
-      </w:r>
-    </w:p>
-    <w:p>
-      <w:pPr>
-        <w:numPr>
           <w:ilvl w:val="0"/>
           <w:numId w:val="1018"/>
         </w:numPr>
@@ -3107,18 +3155,6 @@
     <w:p>
       <w:pPr>
         <w:numPr>
-          <w:ilvl w:val="1"/>
-          <w:numId w:val="1022"/>
-        </w:numPr>
-        <w:pStyle w:val="Compact"/>
-      </w:pPr>
-      <w:r>
-        <w:t xml:space="preserve">M2U4 Onboarding &amp; Tutorial Design — teach the snap→materialize→attribute-solve loop in the first area without a wall of text.</w:t>
-      </w:r>
-    </w:p>
-    <w:p>
-      <w:pPr>
-        <w:numPr>
           <w:ilvl w:val="0"/>
           <w:numId w:val="1018"/>
         </w:numPr>
@@ -3128,49 +3164,13 @@
         <w:rPr>
           <w:b/>
         </w:rPr>
-        <w:t xml:space="preserve">Art M1:</w:t>
-      </w:r>
-      <w:r>
-        <w:t xml:space="preserve"> </w:t>
-      </w:r>
-      <w:r>
-        <w:t xml:space="preserve">1 artist (objects are photo-generated, so environment + UI are the art payload)</w:t>
-      </w:r>
-    </w:p>
-    <w:p>
-      <w:pPr>
-        <w:numPr>
-          <w:ilvl w:val="1"/>
-          <w:numId w:val="1023"/>
-        </w:numPr>
-        <w:pStyle w:val="Compact"/>
-      </w:pPr>
-      <w:r>
-        <w:t xml:space="preserve">M1A1 ⭐ Art Bible / Proof of Concept (the prison/escape visual direction — palette, time-of-day mood, how generated meshes sit in the scene)</w:t>
-      </w:r>
-    </w:p>
-    <w:p>
-      <w:pPr>
-        <w:numPr>
-          <w:ilvl w:val="1"/>
-          <w:numId w:val="1023"/>
-        </w:numPr>
-        <w:pStyle w:val="Compact"/>
-      </w:pPr>
-      <w:r>
-        <w:t xml:space="preserve">M1A3 Environment, Props &amp; VFX Concepts (the cells/rooms, the snap/materialize VFX and the generation-in-progress effect)</w:t>
-      </w:r>
-    </w:p>
-    <w:p>
-      <w:pPr>
-        <w:numPr>
-          <w:ilvl w:val="1"/>
-          <w:numId w:val="1023"/>
-        </w:numPr>
-        <w:pStyle w:val="Compact"/>
-      </w:pPr>
-      <w:r>
-        <w:t xml:space="preserve">M1A4 UI Art Concepts &amp; Typography (photo-capture UI, snap-budget counter, status indicator)</w:t>
+        <w:t xml:space="preserve">Art:</w:t>
+      </w:r>
+      <w:r>
+        <w:t xml:space="preserve"> </w:t>
+      </w:r>
+      <w:r>
+        <w:t xml:space="preserve">0 artists — the art surface (the cells/rooms, the time-of-day lighting, the camera/HUD and the snap/materialize effects) is covered by the D11 conditionals, taken as Design goals by the single designer (see Design M1/M2). Because the interactive objects are **photo-generated**, this surface is modest — 0 artists is more workable here than for a typical game, though the environment/time-of-day + UI art still needs the designer's attention under D11.</w:t>
       </w:r>
     </w:p>
     <w:p>
@@ -3185,43 +3185,31 @@
         <w:rPr>
           <w:b/>
         </w:rPr>
-        <w:t xml:space="preserve">Art M2:</w:t>
-      </w:r>
-    </w:p>
-    <w:p>
-      <w:pPr>
-        <w:numPr>
-          <w:ilvl w:val="1"/>
-          <w:numId w:val="1024"/>
-        </w:numPr>
-        <w:pStyle w:val="Compact"/>
-      </w:pPr>
-      <w:r>
-        <w:t xml:space="preserve">M2A1 ⭐ Critical Asset Production &amp; In-Engine Visual Quality (rooms, time-of-day lighting, HUD implemented and consistent)</w:t>
-      </w:r>
-    </w:p>
-    <w:p>
-      <w:pPr>
-        <w:numPr>
-          <w:ilvl w:val="1"/>
-          <w:numId w:val="1024"/>
-        </w:numPr>
-        <w:pStyle w:val="Compact"/>
-      </w:pPr>
-      <w:r>
-        <w:t xml:space="preserve">M2A3 Environment Alive — Ambient Animation &amp; Layering (the four time-of-day looks of the rooms)</w:t>
-      </w:r>
-    </w:p>
-    <w:p>
-      <w:pPr>
-        <w:numPr>
-          <w:ilvl w:val="1"/>
-          <w:numId w:val="1024"/>
-        </w:numPr>
-        <w:pStyle w:val="Compact"/>
-      </w:pPr>
-      <w:r>
-        <w:t xml:space="preserve">M2A4 UI Art — States &amp; Feedback (framing / generating / spawned / out-of-charge states)</w:t>
+        <w:t xml:space="preserve">TEAM M1:</w:t>
+      </w:r>
+    </w:p>
+    <w:p>
+      <w:pPr>
+        <w:numPr>
+          <w:ilvl w:val="1"/>
+          <w:numId w:val="1023"/>
+        </w:numPr>
+        <w:pStyle w:val="Compact"/>
+      </w:pPr>
+      <w:r>
+        <w:t xml:space="preserve">M1TA1 ⭐ Overall Audio Experience — initial BGM/SFX from the week-5 needs list present &amp; working in the prototype (tense escape BGM, camera-shutter, materialize, puzzle-solve and error cues), suitable and correctly triggered.</w:t>
+      </w:r>
+    </w:p>
+    <w:p>
+      <w:pPr>
+        <w:numPr>
+          <w:ilvl w:val="1"/>
+          <w:numId w:val="1023"/>
+        </w:numPr>
+        <w:pStyle w:val="Compact"/>
+      </w:pPr>
+      <w:r>
+        <w:t xml:space="preserve">M1TA2 ⭐ Audio Engine Functionality — data-driven audio pipeline (add/replace files without recompiling) + reliable multi-channel playback.</w:t>
       </w:r>
     </w:p>
     <w:p>
@@ -3236,45 +3224,6 @@
         <w:rPr>
           <w:b/>
         </w:rPr>
-        <w:t xml:space="preserve">TEAM M1:</w:t>
-      </w:r>
-    </w:p>
-    <w:p>
-      <w:pPr>
-        <w:numPr>
-          <w:ilvl w:val="1"/>
-          <w:numId w:val="1025"/>
-        </w:numPr>
-        <w:pStyle w:val="Compact"/>
-      </w:pPr>
-      <w:r>
-        <w:t xml:space="preserve">M1TA1 ⭐ Overall Audio Experience — initial BGM/SFX from the week-5 needs list present &amp; working in the prototype (tense escape BGM, camera-shutter, materialize, puzzle-solve and error cues), suitable and correctly triggered.</w:t>
-      </w:r>
-    </w:p>
-    <w:p>
-      <w:pPr>
-        <w:numPr>
-          <w:ilvl w:val="1"/>
-          <w:numId w:val="1025"/>
-        </w:numPr>
-        <w:pStyle w:val="Compact"/>
-      </w:pPr>
-      <w:r>
-        <w:t xml:space="preserve">M1TA2 ⭐ Audio Engine Functionality — data-driven audio pipeline (add/replace files without recompiling) + reliable multi-channel playback.</w:t>
-      </w:r>
-    </w:p>
-    <w:p>
-      <w:pPr>
-        <w:numPr>
-          <w:ilvl w:val="0"/>
-          <w:numId w:val="1018"/>
-        </w:numPr>
-        <w:pStyle w:val="Compact"/>
-      </w:pPr>
-      <w:r>
-        <w:rPr>
-          <w:b/>
-        </w:rPr>
         <w:t xml:space="preserve">TEAM M2:</w:t>
       </w:r>
     </w:p>
@@ -3282,7 +3231,7 @@
       <w:pPr>
         <w:numPr>
           <w:ilvl w:val="1"/>
-          <w:numId w:val="1026"/>
+          <w:numId w:val="1024"/>
         </w:numPr>
         <w:pStyle w:val="Compact"/>
       </w:pPr>
@@ -3294,7 +3243,7 @@
       <w:pPr>
         <w:numPr>
           <w:ilvl w:val="1"/>
-          <w:numId w:val="1026"/>
+          <w:numId w:val="1024"/>
         </w:numPr>
         <w:pStyle w:val="Compact"/>
       </w:pPr>
@@ -3306,7 +3255,7 @@
       <w:pPr>
         <w:numPr>
           <w:ilvl w:val="1"/>
-          <w:numId w:val="1026"/>
+          <w:numId w:val="1024"/>
         </w:numPr>
         <w:pStyle w:val="Compact"/>
       </w:pPr>
@@ -3793,12 +3742,6 @@
     <w:abstractNumId w:val="991"/>
   </w:num>
   <w:num w:numId="1024">
-    <w:abstractNumId w:val="991"/>
-  </w:num>
-  <w:num w:numId="1025">
-    <w:abstractNumId w:val="991"/>
-  </w:num>
-  <w:num w:numId="1026">
     <w:abstractNumId w:val="991"/>
   </w:num>
 </w:numbering>

</xml_diff>